<commit_message>
Último cambio primer informe
</commit_message>
<xml_diff>
--- a/informes/Informe_fase_inicial_TFG.docx
+++ b/informes/Informe_fase_inicial_TFG.docx
@@ -26,19 +26,7 @@
         <w:rPr>
           <w:lang w:val="es-ES"/>
         </w:rPr>
-        <w:t>El credit scoring consiste en estimar la probabilidad de que un solicitante no atienda sus obligaciones de pago, y en usar esa estimación para conceder o denegar el crédito. El instrumento habitual ha sido durante décadas la regresión logística, elegida no por su rendimiento sino porque se puede leer entera</w:t>
-      </w:r>
-      <w:r>
-        <w:rPr>
-          <w:lang w:val="es-ES"/>
-        </w:rPr>
-        <w:t xml:space="preserve">: </w:t>
-      </w:r>
-      <w:r>
-        <w:rPr>
-          <w:lang w:val="es-ES"/>
-        </w:rPr>
-        <w:t>la contribución de cada variable a la decisión sobre un cliente concreto es inmediata de calcular y de comunicar. Los ensembles de árboles la superan de forma sistemática en capacidad predictiva (</w:t>
+        <w:t xml:space="preserve">Los modelos de aprendizaje automático que mejor predicen son también los más opacos. Se conocen sus parámetros, pero ninguna persona puede leer en ellos por qué han producido una salida concreta: por ejemplo, un ensemble de varios cientos de árboles no admite la lectura directa que sí admite una regresión lineal. Lo cual es de suma importancia cuando de su salida depende una decisión sobre una persona. De ahí la tensión entre capacidad predictiva e interpretabilidad, y de ahí que la explicabilidad de la inteligencia artificial (XAI) se haya consolidado como campo propio </w:t>
       </w:r>
       <w:hyperlink r:id="rId6">
         <w:r>
@@ -47,14 +35,32 @@
             <w:u w:val="single"/>
             <w:lang w:val="es-ES"/>
           </w:rPr>
-          <w:t>Lessmann et al., 2015</w:t>
+          <w:t>(</w:t>
+        </w:r>
+        <w:proofErr w:type="spellStart"/>
+        <w:r>
+          <w:rPr>
+            <w:color w:val="0563C1"/>
+            <w:u w:val="single"/>
+            <w:lang w:val="es-ES"/>
+          </w:rPr>
+          <w:t>Adadi</w:t>
+        </w:r>
+        <w:proofErr w:type="spellEnd"/>
+        <w:r>
+          <w:rPr>
+            <w:color w:val="0563C1"/>
+            <w:u w:val="single"/>
+            <w:lang w:val="es-ES"/>
+          </w:rPr>
+          <w:t xml:space="preserve"> y Berrada, 2018)</w:t>
         </w:r>
       </w:hyperlink>
       <w:r>
         <w:rPr>
           <w:lang w:val="es-ES"/>
         </w:rPr>
-        <w:t>), pero un modelo de varios cientos de árboles ya no se puede leer. Es una caja negra: se conocen sus parámetros, pero ninguna persona puede extraer de ellos por qué se ha denegado un crédito.</w:t>
+        <w:t>.</w:t>
       </w:r>
     </w:p>
     <w:p>
@@ -67,19 +73,102 @@
         <w:rPr>
           <w:lang w:val="es-ES"/>
         </w:rPr>
-        <w:t xml:space="preserve">En crédito esa opacidad </w:t>
+        <w:t xml:space="preserve">Ante esa tensión hay dos respuestas. La primera es renunciar a la caja negra y emplear modelos interpretables por construcción; </w:t>
+      </w:r>
+      <w:hyperlink r:id="rId7">
+        <w:r>
+          <w:rPr>
+            <w:color w:val="0563C1"/>
+            <w:u w:val="single"/>
+            <w:lang w:val="es-ES"/>
+          </w:rPr>
+          <w:t>Rudin (2019)</w:t>
+        </w:r>
+      </w:hyperlink>
+      <w:r>
+        <w:rPr>
+          <w:lang w:val="es-ES"/>
+        </w:rPr>
+        <w:t xml:space="preserve"> sostiene que en decisiones de alto riesgo es la única opción defendible. La segunda, mayoritaria en la práctica, es conservar el modelo y explicarlo a posteriori, con métodos </w:t>
+      </w:r>
+      <w:r>
+        <w:rPr>
+          <w:i/>
+          <w:lang w:val="es-ES"/>
+        </w:rPr>
+        <w:t>post-hoc</w:t>
       </w:r>
       <w:r>
         <w:rPr>
           <w:lang w:val="es-ES"/>
         </w:rPr>
-        <w:t>supone un gran inconveniente</w:t>
+        <w:t xml:space="preserve">, globales o locales según expliquen el modelo en conjunto o una predicción concreta. Dentro de ellos conviven dos familias: la atribución de importancia a las variables, con LIME </w:t>
       </w:r>
+      <w:hyperlink r:id="rId8">
+        <w:r>
+          <w:rPr>
+            <w:color w:val="0563C1"/>
+            <w:u w:val="single"/>
+            <w:lang w:val="es-ES"/>
+          </w:rPr>
+          <w:t>(Ribeiro et al., 2016)</w:t>
+        </w:r>
+      </w:hyperlink>
       <w:r>
         <w:rPr>
           <w:lang w:val="es-ES"/>
         </w:rPr>
-        <w:t>. El Reglamento General de Protección de Datos obliga a informar sobre la lógica aplicada en las decisiones automatizadas, la Directiva (UE) 2023/2225 de crédito al consumo reconoce al solicitante el derecho a una explicación clara y comprensible, y el Reglamento (UE) 2024/1689 de inteligencia artificial clasifica la evaluación de solvencia como sistema de alto riesgo. La respuesta habitual es no renunciar al modelo y explicarlo a posteriori; dentro de esa familia, SHAP se ha convertido en el estándar de facto.</w:t>
+        <w:t xml:space="preserve"> y SHAP </w:t>
+      </w:r>
+      <w:hyperlink r:id="rId9">
+        <w:r>
+          <w:rPr>
+            <w:color w:val="0563C1"/>
+            <w:u w:val="single"/>
+            <w:lang w:val="es-ES"/>
+          </w:rPr>
+          <w:t>(Lundberg y Lee, 2017)</w:t>
+        </w:r>
+      </w:hyperlink>
+      <w:r>
+        <w:rPr>
+          <w:lang w:val="es-ES"/>
+        </w:rPr>
+        <w:t xml:space="preserve">, hoy el estándar y los más usados, y las explicaciones contrafactuales </w:t>
+      </w:r>
+      <w:hyperlink r:id="rId10">
+        <w:r>
+          <w:rPr>
+            <w:color w:val="0563C1"/>
+            <w:u w:val="single"/>
+            <w:lang w:val="es-ES"/>
+          </w:rPr>
+          <w:t>(</w:t>
+        </w:r>
+        <w:proofErr w:type="spellStart"/>
+        <w:r>
+          <w:rPr>
+            <w:color w:val="0563C1"/>
+            <w:u w:val="single"/>
+            <w:lang w:val="es-ES"/>
+          </w:rPr>
+          <w:t>Mothilal</w:t>
+        </w:r>
+        <w:proofErr w:type="spellEnd"/>
+        <w:r>
+          <w:rPr>
+            <w:color w:val="0563C1"/>
+            <w:u w:val="single"/>
+            <w:lang w:val="es-ES"/>
+          </w:rPr>
+          <w:t xml:space="preserve"> et al., 2020)</w:t>
+        </w:r>
+      </w:hyperlink>
+      <w:r>
+        <w:rPr>
+          <w:lang w:val="es-ES"/>
+        </w:rPr>
+        <w:t>.</w:t>
       </w:r>
     </w:p>
     <w:p>
@@ -92,33 +181,123 @@
         <w:rPr>
           <w:lang w:val="es-ES"/>
         </w:rPr>
-        <w:t xml:space="preserve">El punto débil es que una explicación post-hoc es, a su vez, una </w:t>
+        <w:t xml:space="preserve">El punto débil de esa vía es que la explicación no forma parte del modelo: se calcula aparte y, como toda estimación, tiene varianza. Depende de la muestra de entrenamiento, de la semilla y, en el caso de SHAP, del conjunto de datos de referencia respecto al que se mide cada contribución. Si la explicación de un mismo caso cambia al reentrenar el modelo o al compararlo con otra población, deja de justificar la decisión. Hasta qué punto las explicaciones son estables y coherentes es </w:t>
       </w:r>
       <w:r>
         <w:rPr>
           <w:lang w:val="es-ES"/>
         </w:rPr>
-        <w:t>estimación</w:t>
+        <w:t>un posible</w:t>
       </w:r>
       <w:r>
         <w:rPr>
           <w:lang w:val="es-ES"/>
         </w:rPr>
-        <w:t>: depende de la muestra con la que se entrenó el modelo, de la semilla y del conjunto de datos de referencia respecto al que se mide cada contribución. Si la explicación de un mismo cliente cambia al reentrenar el modelo o al compararlo con otra cartera, no puede sostener una denegación. Hay indicios de que</w:t>
+        <w:t xml:space="preserve"> problema </w:t>
       </w:r>
       <w:r>
         <w:rPr>
           <w:lang w:val="es-ES"/>
         </w:rPr>
-        <w:t xml:space="preserve"> esto</w:t>
+        <w:t>a abordar en</w:t>
       </w:r>
       <w:r>
         <w:rPr>
           <w:lang w:val="es-ES"/>
         </w:rPr>
-        <w:t xml:space="preserve"> ocurre: </w:t>
+        <w:t xml:space="preserve"> este trabajo.</w:t>
       </w:r>
-      <w:hyperlink r:id="rId7">
+    </w:p>
+    <w:p>
+      <w:pPr>
+        <w:rPr>
+          <w:lang w:val="es-ES"/>
+        </w:rPr>
+      </w:pPr>
+      <w:r>
+        <w:rPr>
+          <w:lang w:val="es-ES"/>
+        </w:rPr>
+        <w:t xml:space="preserve">Para estudiarlo hace falta un dominio concreto, y el credit scoring —estimar la probabilidad de impago de un solicitante para conceder o denegar el crédito— resulta especialmente adecuado. La regresión logística ha sido durante décadas el modelo habitual, elegida no por su rendimiento sino porque se puede leer entera, mientras que los ensembles de árboles la superan de forma sistemática </w:t>
+      </w:r>
+      <w:hyperlink r:id="rId11">
+        <w:r>
+          <w:rPr>
+            <w:color w:val="0563C1"/>
+            <w:u w:val="single"/>
+            <w:lang w:val="es-ES"/>
+          </w:rPr>
+          <w:t>(Lessmann et al., 2015)</w:t>
+        </w:r>
+      </w:hyperlink>
+      <w:r>
+        <w:rPr>
+          <w:lang w:val="es-ES"/>
+        </w:rPr>
+        <w:t xml:space="preserve">. Además la explicación es aquí una obligación legal: la imponen el </w:t>
+      </w:r>
+      <w:hyperlink r:id="rId12">
+        <w:r>
+          <w:rPr>
+            <w:color w:val="0563C1"/>
+            <w:u w:val="single"/>
+            <w:lang w:val="es-ES"/>
+          </w:rPr>
+          <w:t>Reglamento General de Protección de Datos</w:t>
+        </w:r>
+      </w:hyperlink>
+      <w:r>
+        <w:rPr>
+          <w:lang w:val="es-ES"/>
+        </w:rPr>
+        <w:t xml:space="preserve"> y la </w:t>
+      </w:r>
+      <w:hyperlink r:id="rId13">
+        <w:r>
+          <w:rPr>
+            <w:color w:val="0563C1"/>
+            <w:u w:val="single"/>
+            <w:lang w:val="es-ES"/>
+          </w:rPr>
+          <w:t>Directiva (UE) 2023/2225</w:t>
+        </w:r>
+      </w:hyperlink>
+      <w:r>
+        <w:rPr>
+          <w:lang w:val="es-ES"/>
+        </w:rPr>
+        <w:t xml:space="preserve"> de crédito al consumo, y el </w:t>
+      </w:r>
+      <w:hyperlink r:id="rId14">
+        <w:r>
+          <w:rPr>
+            <w:color w:val="0563C1"/>
+            <w:u w:val="single"/>
+            <w:lang w:val="es-ES"/>
+          </w:rPr>
+          <w:t>Reglamento (UE) 2024/1689</w:t>
+        </w:r>
+      </w:hyperlink>
+      <w:r>
+        <w:rPr>
+          <w:lang w:val="es-ES"/>
+        </w:rPr>
+        <w:t xml:space="preserve"> de inteligencia artificial clasifica la evaluación de solvencia como sistema de alto riesgo.</w:t>
+      </w:r>
+    </w:p>
+    <w:p>
+      <w:pPr>
+        <w:rPr>
+          <w:lang w:val="es-ES"/>
+        </w:rPr>
+      </w:pPr>
+      <w:r>
+        <w:rPr>
+          <w:lang w:val="es-ES"/>
+        </w:rPr>
+        <w:t xml:space="preserve">Hay además indicios de inestabilidad ya documentados en este dominio: </w:t>
+      </w:r>
+      <w:hyperlink r:id="rId15">
         <w:r>
           <w:rPr>
             <w:color w:val="0563C1"/>
@@ -132,73 +311,67 @@
         <w:rPr>
           <w:lang w:val="es-ES"/>
         </w:rPr>
-        <w:t xml:space="preserve"> obtienen un W de Kendall de 0,93 para las cinco variables más importantes pero de 0,34 para las de importancia intermedia, y </w:t>
+        <w:t xml:space="preserve"> miden sobre cien reentrenamientos de un XGBoost que el ranking de importancia SHAP solo se mantiene en las variables dominantes, y </w:t>
       </w:r>
-      <w:hyperlink r:id="rId8">
+      <w:hyperlink r:id="rId16">
         <w:r>
           <w:rPr>
             <w:color w:val="0563C1"/>
             <w:u w:val="single"/>
             <w:lang w:val="es-ES"/>
           </w:rPr>
-          <w:t>García-Céspedes et al. (2025)</w:t>
+          <w:t>García-</w:t>
+        </w:r>
+        <w:proofErr w:type="spellStart"/>
+        <w:r>
+          <w:rPr>
+            <w:color w:val="0563C1"/>
+            <w:u w:val="single"/>
+            <w:lang w:val="es-ES"/>
+          </w:rPr>
+          <w:t>Céspedes</w:t>
+        </w:r>
+        <w:proofErr w:type="spellEnd"/>
+        <w:r>
+          <w:rPr>
+            <w:color w:val="0563C1"/>
+            <w:u w:val="single"/>
+            <w:lang w:val="es-ES"/>
+          </w:rPr>
+          <w:t xml:space="preserve"> et al. (2025)</w:t>
         </w:r>
       </w:hyperlink>
       <w:r>
         <w:rPr>
           <w:lang w:val="es-ES"/>
         </w:rPr>
-        <w:t xml:space="preserve"> muestran que la explicación de un cliente cambia con el conjunto de referencia aunque el cliente no cambie.</w:t>
-      </w:r>
-    </w:p>
-    <w:p>
-      <w:pPr>
-        <w:rPr>
-          <w:lang w:val="es-ES"/>
-        </w:rPr>
-      </w:pPr>
-      <w:r>
-        <w:rPr>
-          <w:lang w:val="es-ES"/>
-        </w:rPr>
-        <w:t xml:space="preserve">De ahí </w:t>
+        <w:t xml:space="preserve"> muestran que la explicación de un mismo cliente cambia con el conjunto de referencia aunque el cliente no cambie. De ahí se podría plantear una posible pregunta para este </w:t>
       </w:r>
       <w:r>
         <w:rPr>
           <w:lang w:val="es-ES"/>
         </w:rPr>
-        <w:t>se podría plantear una posible</w:t>
+        <w:t xml:space="preserve">TFG: en qué condiciones las explicaciones SHAP de un </w:t>
+      </w:r>
+      <w:proofErr w:type="spellStart"/>
+      <w:r>
+        <w:rPr>
+          <w:lang w:val="es-ES"/>
+        </w:rPr>
+        <w:t>XGBoost</w:t>
+      </w:r>
+      <w:proofErr w:type="spellEnd"/>
+      <w:r>
+        <w:rPr>
+          <w:lang w:val="es-ES"/>
+        </w:rPr>
+        <w:t xml:space="preserve"> son estables y coherentes, tomando como referencia una regresión logística entrenada sobre los mismos datos.</w:t>
       </w:r>
       <w:r>
         <w:rPr>
           <w:lang w:val="es-ES"/>
         </w:rPr>
-        <w:t xml:space="preserve"> pregunta </w:t>
-      </w:r>
-      <w:r>
-        <w:rPr>
-          <w:lang w:val="es-ES"/>
-        </w:rPr>
-        <w:t>para</w:t>
-      </w:r>
-      <w:r>
-        <w:rPr>
-          <w:lang w:val="es-ES"/>
-        </w:rPr>
-        <w:t xml:space="preserve"> este TFG: </w:t>
-      </w:r>
-      <w:r>
-        <w:rPr>
-          <w:b/>
-          <w:lang w:val="es-ES"/>
-        </w:rPr>
-        <w:t>en qué condiciones las explicaciones SHAP de un XGBoost son estables y coherentes</w:t>
-      </w:r>
-      <w:r>
-        <w:rPr>
-          <w:lang w:val="es-ES"/>
-        </w:rPr>
-        <w:t>, tomando como referencia una regresión logística entrenada sobre los mismos datos.</w:t>
+        <w:br w:type="page"/>
       </w:r>
     </w:p>
     <w:p>
@@ -212,6 +385,7 @@
         <w:rPr>
           <w:lang w:val="es-ES"/>
         </w:rPr>
+        <w:lastRenderedPageBreak/>
         <w:t>2. Marco teórico</w:t>
       </w:r>
     </w:p>
@@ -225,7 +399,32 @@
         <w:rPr>
           <w:lang w:val="es-ES"/>
         </w:rPr>
-        <w:t>Un modelo puede ser interpretable de forma intrínseca, cuando su propia estructura es legible, o explicarse post-hoc, cuando la explicación se obtiene de un modelo ya entrenado; y una explicación puede ser global, sobre el modelo en conjunto, o local, sobre una predicción concreta. En crédito la obligación es local: hay que justificar la decisión de un solicitante determinado. Los dos métodos post-hoc de referencia son LIME y SHAP.</w:t>
+        <w:t xml:space="preserve">El trabajo se centraría en el enfoque </w:t>
+      </w:r>
+      <w:r>
+        <w:rPr>
+          <w:i/>
+          <w:lang w:val="es-ES"/>
+        </w:rPr>
+        <w:t>post-hoc</w:t>
+      </w:r>
+      <w:r>
+        <w:rPr>
+          <w:lang w:val="es-ES"/>
+        </w:rPr>
+        <w:t xml:space="preserve"> y local, que es el que corresponde a</w:t>
+      </w:r>
+      <w:r>
+        <w:rPr>
+          <w:lang w:val="es-ES"/>
+        </w:rPr>
+        <w:t xml:space="preserve"> </w:t>
+      </w:r>
+      <w:r>
+        <w:rPr>
+          <w:lang w:val="es-ES"/>
+        </w:rPr>
+        <w:t>justificar una decisión concreta. Esta sección resume la posible base sobre la que se trabajaría y algunos conceptos que, aunque puede que no lleguen a trabajarse, es importante valorar al principio.</w:t>
       </w:r>
     </w:p>
     <w:p>
@@ -252,30 +451,23 @@
         <w:rPr>
           <w:lang w:val="es-ES"/>
         </w:rPr>
-        <w:t>LIME (</w:t>
+        <w:t xml:space="preserve">LIME </w:t>
       </w:r>
-      <w:hyperlink r:id="rId9">
+      <w:hyperlink r:id="rId17">
         <w:r>
           <w:rPr>
             <w:color w:val="0563C1"/>
             <w:u w:val="single"/>
             <w:lang w:val="es-ES"/>
           </w:rPr>
-          <w:t>Ribeiro et al., 2016</w:t>
+          <w:t>(Ribeiro et al., 2016)</w:t>
         </w:r>
       </w:hyperlink>
       <w:r>
         <w:rPr>
           <w:lang w:val="es-ES"/>
         </w:rPr>
-        <w:t xml:space="preserve">) aproxima el modelo en el entorno de una instancia por un modelo lineal: genera instancias perturbadas alrededor de ella, las etiqueta con las predicciones del modelo original, las pondera según su proximidad y ajusta sobre ellas una regresión lineal dispersa cuyos coeficientes son la explicación. Es agnóstico al modelo y barato, pero el vecindario es una elección arbitraria, las perturbaciones se generan al azar —de modo que dos ejecuciones sobre la misma instancia pueden dar </w:t>
-      </w:r>
-      <w:r>
-        <w:rPr>
-          <w:lang w:val="es-ES"/>
-        </w:rPr>
-        <w:lastRenderedPageBreak/>
-        <w:t>explicaciones distintas— y las contribuciones no suman la predicción. Queda fuera del alcance del trabajo, que evalúa un único método, pero es la referencia obligada del estado del arte porque los estudios de estabilidad en credit scoring lo comparan siempre con SHAP.</w:t>
+        <w:t xml:space="preserve"> aproxima el modelo en el entorno de una instancia por un modelo lineal: genera instancias perturbadas a su alrededor, las etiqueta con el modelo original, las pondera según su proximidad y ajusta sobre ellas una regresión lineal dispersa cuyos coeficientes son la explicación. Es agnóstico al modelo y barato, pero el vecindario es una elección arbitraria, las perturbaciones son aleatorias —dos ejecuciones sobre la misma instancia pueden dar explicaciones distintas— y las contribuciones no suman la predicción.</w:t>
       </w:r>
     </w:p>
     <w:p>
@@ -302,23 +494,23 @@
         <w:rPr>
           <w:lang w:val="es-ES"/>
         </w:rPr>
-        <w:t>SHAP (</w:t>
+        <w:t xml:space="preserve">SHAP </w:t>
       </w:r>
-      <w:hyperlink r:id="rId10">
+      <w:hyperlink r:id="rId18">
         <w:r>
           <w:rPr>
             <w:color w:val="0563C1"/>
             <w:u w:val="single"/>
             <w:lang w:val="es-ES"/>
           </w:rPr>
-          <w:t>Lundberg y Lee, 2017</w:t>
+          <w:t>(Lundberg y Lee, 2017)</w:t>
         </w:r>
       </w:hyperlink>
       <w:r>
         <w:rPr>
           <w:lang w:val="es-ES"/>
         </w:rPr>
-        <w:t xml:space="preserve">) plantea el reparto de la predicción entre las variables como un problema de teoría de juegos: los jugadores son las variables y la ganancia a repartir es la diferencia entre la predicción del cliente y la predicción media del modelo. La contribución de la variable </w:t>
+        <w:t xml:space="preserve"> reparte una predicción entre las variables como si fuera un problema de teoría de juegos: los jugadores son las variables y la ganancia a repartir es la diferencia entre la predicción del caso y la predicción media del modelo. La contribución de la variable </w:t>
       </w:r>
       <w:r>
         <w:rPr>
@@ -331,72 +523,7 @@
         <w:rPr>
           <w:lang w:val="es-ES"/>
         </w:rPr>
-        <w:t xml:space="preserve"> es su valor de Shapley, es decir, su aportación marginal promediada sobre todos los órdenes posibles de entrada de las variables.</w:t>
-      </w:r>
-    </w:p>
-    <w:p>
-      <w:pPr>
-        <w:rPr>
-          <w:lang w:val="es-ES"/>
-        </w:rPr>
-      </w:pPr>
-      <w:r>
-        <w:rPr>
-          <w:lang w:val="es-ES"/>
-        </w:rPr>
-        <w:t xml:space="preserve">Su atractivo es que es la única atribución aditiva que cumple tres propiedades a la vez: </w:t>
-      </w:r>
-      <w:r>
-        <w:rPr>
-          <w:b/>
-          <w:lang w:val="es-ES"/>
-        </w:rPr>
-        <w:t>precisión local</w:t>
-      </w:r>
-      <w:r>
-        <w:rPr>
-          <w:lang w:val="es-ES"/>
-        </w:rPr>
-        <w:t xml:space="preserve">, las contribuciones suman exactamente la predicción, de modo que la puntuación de un cliente se descompone sin resto en motivos con su importe; </w:t>
-      </w:r>
-      <w:r>
-        <w:rPr>
-          <w:b/>
-          <w:lang w:val="es-ES"/>
-        </w:rPr>
-        <w:t>ausencia</w:t>
-      </w:r>
-      <w:r>
-        <w:rPr>
-          <w:lang w:val="es-ES"/>
-        </w:rPr>
-        <w:t xml:space="preserve">, una variable no presente no recibe atribución; y </w:t>
-      </w:r>
-      <w:r>
-        <w:rPr>
-          <w:b/>
-          <w:lang w:val="es-ES"/>
-        </w:rPr>
-        <w:t>consistencia</w:t>
-      </w:r>
-      <w:r>
-        <w:rPr>
-          <w:lang w:val="es-ES"/>
-        </w:rPr>
-        <w:t xml:space="preserve">, si una variable pesa más en el modelo su atribución no puede bajar. Tiene dos dificultades prácticas, y las dos son el objeto del trabajo. La primera es que calcular el valor del modelo cuando solo se conoce parte de las variables exige decidir qué significa que una variable no esté, y eso se resuelve promediando sobre un </w:t>
-      </w:r>
-      <w:r>
-        <w:rPr>
-          <w:b/>
-          <w:lang w:val="es-ES"/>
-        </w:rPr>
-        <w:t>conjunto de datos de referencia</w:t>
-      </w:r>
-      <w:r>
-        <w:rPr>
-          <w:lang w:val="es-ES"/>
-        </w:rPr>
-        <w:t>, por lo que la explicación depende de la cartera contra la que se compara al cliente. La segunda es el coste: la suma recorre los 2^M subconjuntos de variables, y la aproximación general, KernelSHAP, muestrea coaliciones, lo que reintroduce variabilidad.</w:t>
+        <w:t xml:space="preserve"> es su valor de Shapley, su aportación marginal promediada sobre todos los órdenes posibles de entrada de las variables. Es la única atribución aditiva que cumple a la vez precisión local (las contribuciones suman exactamente la predicción), ausencia (una variable no presente no recibe atribución) y consistencia (si una variable pesa más en el modelo, su atribución no baja).</w:t>
       </w:r>
     </w:p>
     <w:p>
@@ -419,27 +546,35 @@
           <w:lang w:val="es-ES"/>
         </w:rPr>
       </w:pPr>
+      <w:proofErr w:type="spellStart"/>
       <w:r>
         <w:rPr>
           <w:lang w:val="es-ES"/>
         </w:rPr>
-        <w:t>TreeSHAP (</w:t>
+        <w:t>TreeSHAP</w:t>
       </w:r>
-      <w:hyperlink r:id="rId11">
+      <w:proofErr w:type="spellEnd"/>
+      <w:r>
+        <w:rPr>
+          <w:lang w:val="es-ES"/>
+        </w:rPr>
+        <w:t xml:space="preserve"> </w:t>
+      </w:r>
+      <w:hyperlink r:id="rId19">
         <w:r>
           <w:rPr>
             <w:color w:val="0563C1"/>
             <w:u w:val="single"/>
             <w:lang w:val="es-ES"/>
           </w:rPr>
-          <w:t>Lundberg et al., 2020</w:t>
+          <w:t>(Lundberg et al., 2020)</w:t>
         </w:r>
       </w:hyperlink>
       <w:r>
         <w:rPr>
           <w:lang w:val="es-ES"/>
         </w:rPr>
-        <w:t xml:space="preserve">) resuelve el coste en modelos de árboles: en lugar de enumerar las coaliciones, recorre el árbol propagando por cada rama la proporción de subconjuntos de variables que la seguirían, lo que da un cálculo </w:t>
+        <w:t xml:space="preserve"> resuelve ese coste en modelos de árboles: en lugar de enumerar las coaliciones, recorre el árbol propagando por cada rama la proporción de subconjuntos de variables que la seguirían, con lo que el cálculo es </w:t>
       </w:r>
       <w:r>
         <w:rPr>
@@ -452,7 +587,7 @@
         <w:rPr>
           <w:lang w:val="es-ES"/>
         </w:rPr>
-        <w:t xml:space="preserve"> en tiempo polinómico, O(T·L·D²) para T árboles con L hojas y profundidad D. Tiene dos variantes: </w:t>
+        <w:t xml:space="preserve"> y en tiempo polinómico, O(T·L·D²) para T árboles con L hojas y profundidad D. Tiene dos variantes: </w:t>
       </w:r>
       <w:r>
         <w:rPr>
@@ -478,20 +613,7 @@
         <w:rPr>
           <w:lang w:val="es-ES"/>
         </w:rPr>
-        <w:t xml:space="preserve">, que promedia sobre un conjunto de referencia explícito. Para este trabajo lo decisivo es que TreeSHAP es </w:t>
-      </w:r>
-      <w:r>
-        <w:rPr>
-          <w:b/>
-          <w:lang w:val="es-ES"/>
-        </w:rPr>
-        <w:t>determinista y exacto</w:t>
-      </w:r>
-      <w:r>
-        <w:rPr>
-          <w:lang w:val="es-ES"/>
-        </w:rPr>
-        <w:t xml:space="preserve"> dados el modelo y el conjunto de referencia: así, toda la variabilidad que se observe procede del modelo o del conjunto de referencia, y no del error de muestreo del estimador.</w:t>
+        <w:t>, que promedia sobre uno explícito. Lo decisivo aquí es que, fijados el modelo y el conjunto de referencia, TreeSHAP es determinista: la variabilidad que se observe no procederá del estimador.</w:t>
       </w:r>
     </w:p>
     <w:p>
@@ -505,7 +627,7 @@
         <w:rPr>
           <w:lang w:val="es-ES"/>
         </w:rPr>
-        <w:t>2.4. XGBoost</w:t>
+        <w:t>2.4. Explicaciones contrafactuales: DiCE</w:t>
       </w:r>
     </w:p>
     <w:p>
@@ -518,23 +640,125 @@
         <w:rPr>
           <w:lang w:val="es-ES"/>
         </w:rPr>
-        <w:t>XGBoost (</w:t>
+        <w:t xml:space="preserve">Las explicaciones contrafactuales responden a otra pregunta: no qué variables pesaron en la decisión, sino qué tendría que cambiar para que fuera la contraria. </w:t>
       </w:r>
-      <w:hyperlink r:id="rId12">
+      <w:proofErr w:type="spellStart"/>
+      <w:r>
+        <w:rPr>
+          <w:lang w:val="es-ES"/>
+        </w:rPr>
+        <w:t>DiCE</w:t>
+      </w:r>
+      <w:proofErr w:type="spellEnd"/>
+      <w:r>
+        <w:rPr>
+          <w:lang w:val="es-ES"/>
+        </w:rPr>
+        <w:t xml:space="preserve"> </w:t>
+      </w:r>
+      <w:hyperlink r:id="rId20">
         <w:r>
           <w:rPr>
             <w:color w:val="0563C1"/>
             <w:u w:val="single"/>
             <w:lang w:val="es-ES"/>
           </w:rPr>
-          <w:t>Chen y Guestrin, 2016</w:t>
+          <w:t>(</w:t>
+        </w:r>
+        <w:proofErr w:type="spellStart"/>
+        <w:r>
+          <w:rPr>
+            <w:color w:val="0563C1"/>
+            <w:u w:val="single"/>
+            <w:lang w:val="es-ES"/>
+          </w:rPr>
+          <w:t>Mothilal</w:t>
+        </w:r>
+        <w:proofErr w:type="spellEnd"/>
+        <w:r>
+          <w:rPr>
+            <w:color w:val="0563C1"/>
+            <w:u w:val="single"/>
+            <w:lang w:val="es-ES"/>
+          </w:rPr>
+          <w:t xml:space="preserve"> et al., 2020)</w:t>
         </w:r>
       </w:hyperlink>
       <w:r>
         <w:rPr>
           <w:lang w:val="es-ES"/>
         </w:rPr>
-        <w:t>) es una implementación de gradient boosting con árboles: el modelo es una suma de árboles que se construye de forma aditiva, añadiendo en cada iteración el que más reduce un objetivo que combina la pérdida con una penalización explícita de la complejidad del árbol, por su número de hojas y por la magnitud de sus pesos.</w:t>
+        <w:t xml:space="preserve"> genera, para un caso ya clasificado, varias instancias próximas a él que el modelo clasificaría al revés, buscando a la vez proximidad al caso original, diversidad entre las alternativas propuestas y viabilidad, esto es, respetar los rangos de cada variable y dejar fijas las que el solicitante no puede modificar.</w:t>
+      </w:r>
+    </w:p>
+    <w:p>
+      <w:pPr>
+        <w:pStyle w:val="Ttulo2"/>
+        <w:rPr>
+          <w:lang w:val="es-ES"/>
+        </w:rPr>
+      </w:pPr>
+      <w:r>
+        <w:rPr>
+          <w:lang w:val="es-ES"/>
+        </w:rPr>
+        <w:lastRenderedPageBreak/>
+        <w:t>2.5. XGBoost y la línea base</w:t>
+      </w:r>
+    </w:p>
+    <w:p>
+      <w:pPr>
+        <w:rPr>
+          <w:lang w:val="es-ES"/>
+        </w:rPr>
+      </w:pPr>
+      <w:proofErr w:type="spellStart"/>
+      <w:r>
+        <w:rPr>
+          <w:lang w:val="es-ES"/>
+        </w:rPr>
+        <w:t>XGBoost</w:t>
+      </w:r>
+      <w:proofErr w:type="spellEnd"/>
+      <w:r>
+        <w:rPr>
+          <w:lang w:val="es-ES"/>
+        </w:rPr>
+        <w:t xml:space="preserve"> </w:t>
+      </w:r>
+      <w:hyperlink r:id="rId21">
+        <w:r>
+          <w:rPr>
+            <w:color w:val="0563C1"/>
+            <w:u w:val="single"/>
+            <w:lang w:val="es-ES"/>
+          </w:rPr>
+          <w:t xml:space="preserve">(Chen y </w:t>
+        </w:r>
+        <w:proofErr w:type="spellStart"/>
+        <w:r>
+          <w:rPr>
+            <w:color w:val="0563C1"/>
+            <w:u w:val="single"/>
+            <w:lang w:val="es-ES"/>
+          </w:rPr>
+          <w:t>Guestrin</w:t>
+        </w:r>
+        <w:proofErr w:type="spellEnd"/>
+        <w:r>
+          <w:rPr>
+            <w:color w:val="0563C1"/>
+            <w:u w:val="single"/>
+            <w:lang w:val="es-ES"/>
+          </w:rPr>
+          <w:t>, 2016)</w:t>
+        </w:r>
+      </w:hyperlink>
+      <w:r>
+        <w:rPr>
+          <w:lang w:val="es-ES"/>
+        </w:rPr>
+        <w:t xml:space="preserve"> es una implementación de gradient boosting con árboles: el modelo es una suma de árboles que se construye de forma aditiva, añadiendo en cada iteración el árbol que más reduce un objetivo que combina la pérdida con una penalización explícita de la complejidad del árbol.</w:t>
       </w:r>
     </w:p>
     <w:p>
@@ -547,25 +771,53 @@
         <w:rPr>
           <w:lang w:val="es-ES"/>
         </w:rPr>
-        <w:t>Se usa en este proyecto por cuatro razones. Es la familia que mejor rendimiento obtiene en credit scoring (</w:t>
+        <w:t xml:space="preserve">Se propone para este trabajo por varias razones: es la familia que mejor rendimiento obtiene en </w:t>
       </w:r>
-      <w:hyperlink r:id="rId13">
+      <w:proofErr w:type="spellStart"/>
+      <w:r>
+        <w:rPr>
+          <w:lang w:val="es-ES"/>
+        </w:rPr>
+        <w:t>credit</w:t>
+      </w:r>
+      <w:proofErr w:type="spellEnd"/>
+      <w:r>
+        <w:rPr>
+          <w:lang w:val="es-ES"/>
+        </w:rPr>
+        <w:t xml:space="preserve"> </w:t>
+      </w:r>
+      <w:proofErr w:type="spellStart"/>
+      <w:r>
+        <w:rPr>
+          <w:lang w:val="es-ES"/>
+        </w:rPr>
+        <w:t>scoring</w:t>
+      </w:r>
+      <w:proofErr w:type="spellEnd"/>
+      <w:r>
+        <w:rPr>
+          <w:lang w:val="es-ES"/>
+        </w:rPr>
+        <w:t xml:space="preserve"> </w:t>
+      </w:r>
+      <w:hyperlink r:id="rId22">
         <w:r>
           <w:rPr>
             <w:color w:val="0563C1"/>
             <w:u w:val="single"/>
             <w:lang w:val="es-ES"/>
           </w:rPr>
-          <w:t>Lessmann et al., 2015</w:t>
+          <w:t>(Lessmann et al., 2015)</w:t>
         </w:r>
       </w:hyperlink>
       <w:r>
         <w:rPr>
           <w:lang w:val="es-ES"/>
         </w:rPr>
-        <w:t xml:space="preserve">), de modo que la pregunta sobre sus explicaciones es pertinente. Encaja con los datos de crédito, porque capta no linealidades e interacciones, no necesita escalado y absorbe los valores perdidos sin imputación previa. Es compatible de forma exacta con TreeSHAP, lo que hace viable recalcular las explicaciones de cientos de clientes en cada uno de varias decenas de reentrenamientos. Y permite comparar con la literatura, en particular con </w:t>
+        <w:t xml:space="preserve">; encaja con los datos de crédito, porque capta no linealidades e interacciones y no necesita escalado ni imputación previa; es compatible de forma exacta con TreeSHAP, lo que hace viable recalcular las explicaciones de cientos de clientes en decenas de reentrenamientos; y permite contrastar con </w:t>
       </w:r>
-      <w:hyperlink r:id="rId14">
+      <w:hyperlink r:id="rId23">
         <w:r>
           <w:rPr>
             <w:color w:val="0563C1"/>
@@ -579,14 +831,31 @@
         <w:rPr>
           <w:lang w:val="es-ES"/>
         </w:rPr>
-        <w:t xml:space="preserve">, que lo usan sobre el mismo </w:t>
+        <w:t xml:space="preserve">, que lo usan sobre </w:t>
       </w:r>
       <w:r>
         <w:rPr>
           <w:lang w:val="es-ES"/>
         </w:rPr>
-        <w:lastRenderedPageBreak/>
-        <w:t>conjunto de datos. Además, su entrenamiento es estocástico, por el submuestreo de filas y de columnas, que es justamente la sensibilidad que el trabajo quiere medir.</w:t>
+        <w:t>uno de los conjuntos de datos que se proponen en este informe (el de Taiwán)</w:t>
+      </w:r>
+      <w:r>
+        <w:rPr>
+          <w:lang w:val="es-ES"/>
+        </w:rPr>
+        <w:t>. Además, su entrenamiento es estocástico, por el submuestreo de filas y de columnas, que es justamente una de las sensibilidades que el trabaj</w:t>
+      </w:r>
+      <w:r>
+        <w:rPr>
+          <w:lang w:val="es-ES"/>
+        </w:rPr>
+        <w:t>o podría medir</w:t>
+      </w:r>
+      <w:r>
+        <w:rPr>
+          <w:lang w:val="es-ES"/>
+        </w:rPr>
+        <w:t>.</w:t>
       </w:r>
     </w:p>
     <w:p>
@@ -599,7 +868,19 @@
         <w:rPr>
           <w:lang w:val="es-ES"/>
         </w:rPr>
-        <w:t>Frente a él se entrena una regresión logística con penalización L2 sobre los mismos datos y las mismas particiones, como línea base interpretable por construcción y como referencia de estabilidad.</w:t>
+        <w:t xml:space="preserve">Frente a </w:t>
+      </w:r>
+      <w:r>
+        <w:rPr>
+          <w:lang w:val="es-ES"/>
+        </w:rPr>
+        <w:t>este modelo se podría hacer</w:t>
+      </w:r>
+      <w:r>
+        <w:rPr>
+          <w:lang w:val="es-ES"/>
+        </w:rPr>
+        <w:t xml:space="preserve"> una regresión logística con penalización L2 sobre los mismos datos y las mismas particiones, como línea base y como referencia de estabilidad.</w:t>
       </w:r>
     </w:p>
     <w:p>
@@ -626,31 +907,7 @@
         <w:rPr>
           <w:lang w:val="es-ES"/>
         </w:rPr>
-        <w:t>Se han descargado y analizado cinco conjuntos de datos públicos de credit scoring.</w:t>
-      </w:r>
-    </w:p>
-    <w:p>
-      <w:pPr>
-        <w:spacing w:before="160" w:after="80"/>
-        <w:jc w:val="left"/>
-        <w:rPr>
-          <w:lang w:val="es-ES"/>
-        </w:rPr>
-      </w:pPr>
-      <w:r>
-        <w:rPr>
-          <w:b/>
-          <w:sz w:val="19"/>
-          <w:lang w:val="es-ES"/>
-        </w:rPr>
-        <w:t>Tabla 1.</w:t>
-      </w:r>
-      <w:r>
-        <w:rPr>
-          <w:sz w:val="19"/>
-          <w:lang w:val="es-ES"/>
-        </w:rPr>
-        <w:t xml:space="preserve"> Conjuntos de datos candidatos.</w:t>
+        <w:t>Se han descargado y analizado cinco conjuntos de datos públicos de credit scoring. El número de variables es el de columnas del fichero, incluida la variable objetivo y, cuando existe, el identificador.</w:t>
       </w:r>
     </w:p>
     <w:tbl>
@@ -691,8 +948,18 @@
                 <w:color w:val="FFFFFF"/>
                 <w:sz w:val="17"/>
               </w:rPr>
-              <w:t>Conjunto de datos</w:t>
+              <w:t xml:space="preserve">Conjunto de </w:t>
             </w:r>
+            <w:proofErr w:type="spellStart"/>
+            <w:r>
+              <w:rPr>
+                <w:b/>
+                <w:color w:val="FFFFFF"/>
+                <w:sz w:val="17"/>
+              </w:rPr>
+              <w:t>datos</w:t>
+            </w:r>
+            <w:proofErr w:type="spellEnd"/>
           </w:p>
         </w:tc>
         <w:tc>
@@ -725,6 +992,7 @@
               <w:spacing w:before="40" w:after="40"/>
               <w:jc w:val="left"/>
             </w:pPr>
+            <w:proofErr w:type="spellStart"/>
             <w:r>
               <w:rPr>
                 <w:b/>
@@ -733,6 +1001,7 @@
               </w:rPr>
               <w:t>Observaciones</w:t>
             </w:r>
+            <w:proofErr w:type="spellEnd"/>
           </w:p>
         </w:tc>
         <w:tc>
@@ -771,8 +1040,18 @@
                 <w:color w:val="FFFFFF"/>
                 <w:sz w:val="17"/>
               </w:rPr>
-              <w:t>Tasa de impago</w:t>
+              <w:t xml:space="preserve">Tasa de </w:t>
             </w:r>
+            <w:proofErr w:type="spellStart"/>
+            <w:r>
+              <w:rPr>
+                <w:b/>
+                <w:color w:val="FFFFFF"/>
+                <w:sz w:val="17"/>
+              </w:rPr>
+              <w:t>impago</w:t>
+            </w:r>
+            <w:proofErr w:type="spellEnd"/>
           </w:p>
         </w:tc>
         <w:tc>
@@ -791,8 +1070,18 @@
                 <w:color w:val="FFFFFF"/>
                 <w:sz w:val="17"/>
               </w:rPr>
-              <w:t>Valores perdidos</w:t>
+              <w:t xml:space="preserve">Valores </w:t>
             </w:r>
+            <w:proofErr w:type="spellStart"/>
+            <w:r>
+              <w:rPr>
+                <w:b/>
+                <w:color w:val="FFFFFF"/>
+                <w:sz w:val="17"/>
+              </w:rPr>
+              <w:t>perdidos</w:t>
+            </w:r>
+            <w:proofErr w:type="spellEnd"/>
           </w:p>
         </w:tc>
         <w:tc>
@@ -805,6 +1094,7 @@
               <w:spacing w:before="40" w:after="40"/>
               <w:jc w:val="left"/>
             </w:pPr>
+            <w:proofErr w:type="spellStart"/>
             <w:r>
               <w:rPr>
                 <w:b/>
@@ -813,6 +1103,7 @@
               </w:rPr>
               <w:t>Duplicados</w:t>
             </w:r>
+            <w:proofErr w:type="spellEnd"/>
           </w:p>
         </w:tc>
       </w:tr>
@@ -848,7 +1139,7 @@
               <w:spacing w:before="40" w:after="40"/>
               <w:jc w:val="left"/>
             </w:pPr>
-            <w:hyperlink r:id="rId15">
+            <w:hyperlink r:id="rId24">
               <w:r>
                 <w:rPr>
                   <w:color w:val="0563C1"/>
@@ -978,7 +1269,7 @@
               <w:spacing w:before="40" w:after="40"/>
               <w:jc w:val="left"/>
             </w:pPr>
-            <w:hyperlink r:id="rId16">
+            <w:hyperlink r:id="rId25">
               <w:r>
                 <w:rPr>
                   <w:color w:val="0563C1"/>
@@ -1050,12 +1341,14 @@
               <w:spacing w:before="40" w:after="40"/>
               <w:jc w:val="left"/>
             </w:pPr>
+            <w:proofErr w:type="spellStart"/>
             <w:r>
               <w:rPr>
                 <w:sz w:val="17"/>
               </w:rPr>
               <w:t>Ninguno</w:t>
             </w:r>
+            <w:proofErr w:type="spellEnd"/>
           </w:p>
         </w:tc>
         <w:tc>
@@ -1095,7 +1388,23 @@
                 <w:b/>
                 <w:sz w:val="17"/>
               </w:rPr>
-              <w:t>Default of Credit Card Clients (Taiwán)</w:t>
+              <w:t>Default of Credit Card Clients (</w:t>
+            </w:r>
+            <w:proofErr w:type="spellStart"/>
+            <w:r>
+              <w:rPr>
+                <w:b/>
+                <w:sz w:val="17"/>
+              </w:rPr>
+              <w:t>Taiwán</w:t>
+            </w:r>
+            <w:proofErr w:type="spellEnd"/>
+            <w:r>
+              <w:rPr>
+                <w:b/>
+                <w:sz w:val="17"/>
+              </w:rPr>
+              <w:t>)</w:t>
             </w:r>
           </w:p>
         </w:tc>
@@ -1108,7 +1417,7 @@
               <w:spacing w:before="40" w:after="40"/>
               <w:jc w:val="left"/>
             </w:pPr>
-            <w:hyperlink r:id="rId17">
+            <w:hyperlink r:id="rId26">
               <w:r>
                 <w:rPr>
                   <w:color w:val="0563C1"/>
@@ -1180,12 +1489,14 @@
               <w:spacing w:before="40" w:after="40"/>
               <w:jc w:val="left"/>
             </w:pPr>
+            <w:proofErr w:type="spellStart"/>
             <w:r>
               <w:rPr>
                 <w:sz w:val="17"/>
               </w:rPr>
               <w:t>Ninguno</w:t>
             </w:r>
+            <w:proofErr w:type="spellEnd"/>
           </w:p>
         </w:tc>
         <w:tc>
@@ -1238,7 +1549,7 @@
               <w:spacing w:before="40" w:after="40"/>
               <w:jc w:val="left"/>
             </w:pPr>
-            <w:hyperlink r:id="rId18">
+            <w:hyperlink r:id="rId27">
               <w:r>
                 <w:rPr>
                   <w:color w:val="0563C1"/>
@@ -1263,7 +1574,35 @@
               <w:rPr>
                 <w:sz w:val="17"/>
               </w:rPr>
-              <w:t>307.511 en la tabla principal</w:t>
+              <w:t xml:space="preserve">307.511 </w:t>
+            </w:r>
+            <w:proofErr w:type="spellStart"/>
+            <w:r>
+              <w:rPr>
+                <w:sz w:val="17"/>
+              </w:rPr>
+              <w:t>en</w:t>
+            </w:r>
+            <w:proofErr w:type="spellEnd"/>
+            <w:r>
+              <w:rPr>
+                <w:sz w:val="17"/>
+              </w:rPr>
+              <w:t xml:space="preserve"> la </w:t>
+            </w:r>
+            <w:proofErr w:type="spellStart"/>
+            <w:r>
+              <w:rPr>
+                <w:sz w:val="17"/>
+              </w:rPr>
+              <w:t>tabla</w:t>
+            </w:r>
+            <w:proofErr w:type="spellEnd"/>
+            <w:r>
+              <w:rPr>
+                <w:sz w:val="17"/>
+              </w:rPr>
+              <w:t xml:space="preserve"> principal</w:t>
             </w:r>
           </w:p>
         </w:tc>
@@ -1280,7 +1619,35 @@
               <w:rPr>
                 <w:sz w:val="17"/>
               </w:rPr>
-              <w:t>122 en la tabla principal</w:t>
+              <w:t xml:space="preserve">122 </w:t>
+            </w:r>
+            <w:proofErr w:type="spellStart"/>
+            <w:r>
+              <w:rPr>
+                <w:sz w:val="17"/>
+              </w:rPr>
+              <w:t>en</w:t>
+            </w:r>
+            <w:proofErr w:type="spellEnd"/>
+            <w:r>
+              <w:rPr>
+                <w:sz w:val="17"/>
+              </w:rPr>
+              <w:t xml:space="preserve"> la </w:t>
+            </w:r>
+            <w:proofErr w:type="spellStart"/>
+            <w:r>
+              <w:rPr>
+                <w:sz w:val="17"/>
+              </w:rPr>
+              <w:t>tabla</w:t>
+            </w:r>
+            <w:proofErr w:type="spellEnd"/>
+            <w:r>
+              <w:rPr>
+                <w:sz w:val="17"/>
+              </w:rPr>
+              <w:t xml:space="preserve"> principal</w:t>
             </w:r>
           </w:p>
         </w:tc>
@@ -1372,7 +1739,7 @@
               <w:spacing w:before="40" w:after="40"/>
               <w:jc w:val="left"/>
             </w:pPr>
-            <w:hyperlink r:id="rId19">
+            <w:hyperlink r:id="rId28">
               <w:r>
                 <w:rPr>
                   <w:color w:val="0563C1"/>
@@ -1430,12 +1797,30 @@
             <w:pPr>
               <w:spacing w:before="40" w:after="40"/>
               <w:jc w:val="left"/>
+              <w:rPr>
+                <w:lang w:val="es-ES"/>
+              </w:rPr>
             </w:pPr>
             <w:r>
               <w:rPr>
                 <w:sz w:val="17"/>
+                <w:lang w:val="es-ES"/>
               </w:rPr>
-              <w:t>20,0 %, solo sobre los cerrados</w:t>
+              <w:t xml:space="preserve">20,0 %, solo sobre los </w:t>
+            </w:r>
+            <w:r>
+              <w:rPr>
+                <w:sz w:val="17"/>
+                <w:lang w:val="es-ES"/>
+              </w:rPr>
+              <w:t xml:space="preserve">casos </w:t>
+            </w:r>
+            <w:r>
+              <w:rPr>
+                <w:sz w:val="17"/>
+                <w:lang w:val="es-ES"/>
+              </w:rPr>
+              <w:t>cerrados</w:t>
             </w:r>
           </w:p>
         </w:tc>
@@ -1491,17 +1876,34 @@
           <w:sz w:val="17"/>
           <w:lang w:val="es-ES"/>
         </w:rPr>
-        <w:t>* En South German Credit el 30 % procede de un muestreo estratificado con los créditos malos sobremuestreados; la prevalencia real rondaba el 5 % (</w:t>
+        <w:t xml:space="preserve">* En South German Credit el 30 % procede de un muestreo estratificado con los créditos malos sobremuestreados; la prevalencia real rondaba el 5 % </w:t>
       </w:r>
-      <w:hyperlink r:id="rId20">
+      <w:hyperlink r:id="rId29">
         <w:r>
           <w:rPr>
             <w:color w:val="0563C1"/>
-            <w:sz w:val="17"/>
             <w:u w:val="single"/>
             <w:lang w:val="es-ES"/>
           </w:rPr>
-          <w:t>Grömping, 2019</w:t>
+          <w:t>(</w:t>
+        </w:r>
+        <w:proofErr w:type="spellStart"/>
+        <w:r>
+          <w:rPr>
+            <w:color w:val="0563C1"/>
+            <w:u w:val="single"/>
+            <w:lang w:val="es-ES"/>
+          </w:rPr>
+          <w:t>Grömping</w:t>
+        </w:r>
+        <w:proofErr w:type="spellEnd"/>
+        <w:r>
+          <w:rPr>
+            <w:color w:val="0563C1"/>
+            <w:u w:val="single"/>
+            <w:lang w:val="es-ES"/>
+          </w:rPr>
+          <w:t>, 2019)</w:t>
         </w:r>
       </w:hyperlink>
       <w:r>
@@ -1509,7 +1911,7 @@
           <w:sz w:val="17"/>
           <w:lang w:val="es-ES"/>
         </w:rPr>
-        <w:t>), así que no es comparable con las tasas de los demás.</w:t>
+        <w:t>, así que no es comparable con las tasas de los demás.</w:t>
       </w:r>
     </w:p>
     <w:p>
@@ -1522,9 +1924,21 @@
         <w:rPr>
           <w:lang w:val="es-ES"/>
         </w:rPr>
-        <w:t xml:space="preserve">De los cinco, el de Taiwán parece el más adecuado como conjunto principal: sus 30.000 observaciones y 23 variables predictoras dan tamaño suficiente para reentrenar decenas de veces sin que el coste de cómputo se dispare, no tiene valores perdidos y es el que usan </w:t>
+        <w:t xml:space="preserve">De los cinco, el de Taiwán parece el más adecuado como conjunto principal: sus 30.000 observaciones y 23 variables predictoras dan tamaño suficiente para reentrenar </w:t>
       </w:r>
-      <w:hyperlink r:id="rId21">
+      <w:r>
+        <w:rPr>
+          <w:lang w:val="es-ES"/>
+        </w:rPr>
+        <w:t>múltiples v</w:t>
+      </w:r>
+      <w:r>
+        <w:rPr>
+          <w:lang w:val="es-ES"/>
+        </w:rPr>
+        <w:t xml:space="preserve">eces sin que el coste de cómputo se dispare, no tiene valores perdidos y es el que usan </w:t>
+      </w:r>
+      <w:hyperlink r:id="rId30">
         <w:r>
           <w:rPr>
             <w:color w:val="0563C1"/>
@@ -1538,19 +1952,7 @@
         <w:rPr>
           <w:lang w:val="es-ES"/>
         </w:rPr>
-        <w:t xml:space="preserve"> en un estudio de XGBoost y SHAP en el credit scoring</w:t>
-      </w:r>
-      <w:r>
-        <w:rPr>
-          <w:lang w:val="es-ES"/>
-        </w:rPr>
-        <w:t>, lo que permite contrastar los resultados</w:t>
-      </w:r>
-      <w:r>
-        <w:rPr>
-          <w:lang w:val="es-ES"/>
-        </w:rPr>
-        <w:t>.</w:t>
+        <w:t xml:space="preserve"> en un estudio de XGBoost y SHAP en el credit scoring, lo que permite contrastar los resultados.</w:t>
       </w:r>
     </w:p>
     <w:sectPr>

</xml_diff>